<commit_message>
Póster: actualiza la fuente Word (poster_xpostem_plantilla.docx) con la arquitectura v2.1
Co-Authored-By: Claude Opus 4.8 <noreply@anthropic.com>
</commit_message>
<xml_diff>
--- a/fase4/presentacion/poster_xpostem_plantilla.docx
+++ b/fase4/presentacion/poster_xpostem_plantilla.docx
@@ -521,7 +521,7 @@
         </w:rPr>
         <w:drawing>
           <wp:inline distT="0" distB="0" distL="0" distR="0" wp14:anchorId="187245AC" wp14:editId="7A113E30">
-            <wp:extent cx="3096000" cy="2802887"/>
+            <wp:extent cx="2880000" cy="3152709"/>
             <wp:effectExtent l="0" t="0" r="2540" b="3810"/>
             <wp:docPr id="264176973" name="Imagen 1"/>
             <wp:cNvGraphicFramePr>
@@ -543,7 +543,7 @@
                   <pic:spPr>
                     <a:xfrm>
                       <a:off x="0" y="0"/>
-                      <a:ext cx="3096000" cy="2802887"/>
+                      <a:ext cx="2880000" cy="3152709"/>
                     </a:xfrm>
                     <a:prstGeom prst="rect">
                       <a:avLst/>
@@ -556,6 +556,9 @@
         </w:drawing>
       </w:r>
       <w:r>
+        <w:br/>
+      </w:r>
+      <w:r>
         <w:rPr>
           <w:b/>
           <w:bCs/>
@@ -563,7 +566,7 @@
           <w:iCs/>
           <w:color w:val="215E99" w:themeColor="text2" w:themeTint="BF"/>
         </w:rPr>
-        <w:t>Figure 1. Network architecture and QoS classes.</w:t>
+        <w:t>Figure 1. Network architecture: control room, fiber-optic ring and 802.11ac access mesh.</w:t>
       </w:r>
     </w:p>
     <w:p>
@@ -913,7 +916,7 @@
         </w:rPr>
         <w:drawing>
           <wp:inline distT="0" distB="0" distL="0" distR="0" wp14:anchorId="6ABA3052" wp14:editId="672D1004">
-            <wp:extent cx="4031999" cy="2004218"/>
+            <wp:extent cx="3816000" cy="1896849"/>
             <wp:effectExtent l="0" t="0" r="0" b="0"/>
             <wp:docPr id="54787619" name="Imagen 1"/>
             <wp:cNvGraphicFramePr>
@@ -935,7 +938,7 @@
                   <pic:spPr>
                     <a:xfrm>
                       <a:off x="0" y="0"/>
-                      <a:ext cx="4031999" cy="2004218"/>
+                      <a:ext cx="3816000" cy="1896849"/>
                     </a:xfrm>
                     <a:prstGeom prst="rect">
                       <a:avLst/>
@@ -948,6 +951,9 @@
         </w:drawing>
       </w:r>
       <w:r>
+        <w:br/>
+      </w:r>
+      <w:r>
         <w:rPr>
           <w:b/>
           <w:bCs/>
@@ -980,7 +986,7 @@
         </w:rPr>
         <w:drawing>
           <wp:inline distT="0" distB="0" distL="0" distR="0" wp14:anchorId="6ABA3052" wp14:editId="672D1004">
-            <wp:extent cx="3671999" cy="2090399"/>
+            <wp:extent cx="3456000" cy="1967434"/>
             <wp:effectExtent l="0" t="0" r="0" b="0"/>
             <wp:docPr id="990" name="Imagen 1"/>
             <wp:cNvGraphicFramePr>
@@ -1002,7 +1008,7 @@
                   <pic:spPr>
                     <a:xfrm>
                       <a:off x="0" y="0"/>
-                      <a:ext cx="3671999" cy="2090399"/>
+                      <a:ext cx="3456000" cy="1967434"/>
                     </a:xfrm>
                     <a:prstGeom prst="rect">
                       <a:avLst/>
@@ -1013,6 +1019,9 @@
             </a:graphic>
           </wp:inline>
         </w:drawing>
+      </w:r>
+      <w:r>
+        <w:br/>
       </w:r>
       <w:r>
         <w:rPr>

</xml_diff>

<commit_message>
Póster: autor y asesor alineados al mismo nivel en el encabezado
Se eliminan los 3 párrafos vacíos del segundo autor de la plantilla que empujaban
el bloque del autor hacia arriba. El build script ahora hace todo en un paso
(contenido + alineación + metadatos + thumbnail). PDF A1 regenerado, rastros: cero.

Co-Authored-By: Claude Opus 4.8 <noreply@anthropic.com>
</commit_message>
<xml_diff>
--- a/fase4/presentacion/poster_xpostem_plantilla.docx
+++ b/fase4/presentacion/poster_xpostem_plantilla.docx
@@ -135,74 +135,6 @@
                 <w:lang w:val="en-US"/>
               </w:rPr>
             </w:pPr>
-          </w:p>
-          <w:p>
-            <w:pPr>
-              <w:jc w:val="center"/>
-              <w:rPr>
-                <w:b/>
-                <w:bCs/>
-                <w:color w:val="3A7C22" w:themeColor="accent6" w:themeShade="BF"/>
-                <w:sz w:val="34"/>
-                <w:szCs w:val="34"/>
-                <w:lang w:val="en-US"/>
-              </w:rPr>
-            </w:pPr>
-            <w:r>
-              <w:rPr>
-                <w:b/>
-                <w:bCs/>
-                <w:color w:val="3A7C22" w:themeColor="accent6" w:themeShade="BF"/>
-                <w:sz w:val="34"/>
-                <w:szCs w:val="34"/>
-                <w:lang w:val="en-US"/>
-              </w:rPr>
-              <w:t/>
-            </w:r>
-          </w:p>
-          <w:p>
-            <w:pPr>
-              <w:jc w:val="center"/>
-              <w:rPr>
-                <w:color w:val="3A7C22" w:themeColor="accent6" w:themeShade="BF"/>
-                <w:sz w:val="28"/>
-                <w:szCs w:val="28"/>
-                <w:lang w:val="en-US"/>
-              </w:rPr>
-            </w:pPr>
-            <w:r>
-              <w:rPr>
-                <w:color w:val="3A7C22" w:themeColor="accent6" w:themeShade="BF"/>
-                <w:sz w:val="28"/>
-                <w:szCs w:val="28"/>
-                <w:lang w:val="en-US"/>
-              </w:rPr>
-              <w:t/>
-            </w:r>
-          </w:p>
-          <w:p>
-            <w:pPr>
-              <w:jc w:val="center"/>
-              <w:rPr>
-                <w:i/>
-                <w:iCs/>
-                <w:color w:val="3A7C22" w:themeColor="accent6" w:themeShade="BF"/>
-                <w:sz w:val="28"/>
-                <w:szCs w:val="28"/>
-                <w:lang w:val="en-US"/>
-              </w:rPr>
-            </w:pPr>
-            <w:r>
-              <w:rPr>
-                <w:i/>
-                <w:iCs/>
-                <w:color w:val="3A7C22" w:themeColor="accent6" w:themeShade="BF"/>
-                <w:sz w:val="28"/>
-                <w:szCs w:val="28"/>
-                <w:lang w:val="en-US"/>
-              </w:rPr>
-              <w:t/>
-            </w:r>
           </w:p>
           <w:p>
             <w:pPr>

</xml_diff>